<commit_message>
update plantilla.docx with new content
</commit_message>
<xml_diff>
--- a/plantilla.docx
+++ b/plantilla.docx
@@ -312,9 +312,9 @@
         <w:tblLook w:val="01e0"/>
       </w:tblPr>
       <w:tblGrid>
-        <w:gridCol w:w="3561"/>
+        <w:gridCol w:w="3560"/>
         <w:gridCol w:w="3562"/>
-        <w:gridCol w:w="3307"/>
+        <w:gridCol w:w="3308"/>
       </w:tblGrid>
       <w:tr>
         <w:trPr>
@@ -322,7 +322,7 @@
         </w:trPr>
         <w:tc>
           <w:tcPr>
-            <w:tcW w:w="3561" w:type="dxa"/>
+            <w:tcW w:w="3560" w:type="dxa"/>
             <w:tcBorders>
               <w:top w:val="single" w:sz="4" w:space="0" w:color="000000"/>
               <w:left w:val="single" w:sz="4" w:space="0" w:color="000000"/>
@@ -486,7 +486,7 @@
         </w:tc>
         <w:tc>
           <w:tcPr>
-            <w:tcW w:w="3307" w:type="dxa"/>
+            <w:tcW w:w="3308" w:type="dxa"/>
             <w:tcBorders>
               <w:top w:val="single" w:sz="4" w:space="0" w:color="000000"/>
               <w:left w:val="single" w:sz="4" w:space="0" w:color="000000"/>
@@ -585,7 +585,7 @@
         </w:trPr>
         <w:tc>
           <w:tcPr>
-            <w:tcW w:w="3561" w:type="dxa"/>
+            <w:tcW w:w="3560" w:type="dxa"/>
             <w:tcBorders>
               <w:top w:val="single" w:sz="4" w:space="0" w:color="000000"/>
               <w:left w:val="single" w:sz="4" w:space="0" w:color="000000"/>
@@ -654,32 +654,41 @@
                 <w:rFonts w:ascii="Times New Roman" w:hAnsi="Times New Roman"/>
                 <w:sz w:val="18"/>
               </w:rPr>
-            </w:r>
-          </w:p>
-        </w:tc>
-        <w:tc>
-          <w:tcPr>
-            <w:tcW w:w="3307" w:type="dxa"/>
-            <w:tcBorders>
-              <w:top w:val="single" w:sz="4" w:space="0" w:color="000000"/>
-              <w:left w:val="single" w:sz="4" w:space="0" w:color="000000"/>
-              <w:bottom w:val="single" w:sz="4" w:space="0" w:color="000000"/>
-              <w:right w:val="single" w:sz="4" w:space="0" w:color="000000"/>
-            </w:tcBorders>
-          </w:tcPr>
-          <w:p>
-            <w:pPr>
-              <w:pStyle w:val="TableParagraph"/>
-              <w:rPr>
-                <w:rFonts w:ascii="Times New Roman" w:hAnsi="Times New Roman"/>
-                <w:sz w:val="18"/>
-              </w:rPr>
-            </w:pPr>
-            <w:r>
-              <w:rPr>
-                <w:rFonts w:ascii="Times New Roman" w:hAnsi="Times New Roman"/>
-                <w:sz w:val="18"/>
-              </w:rPr>
+              <w:t>{{num_convenio}}</w:t>
+            </w:r>
+          </w:p>
+        </w:tc>
+        <w:tc>
+          <w:tcPr>
+            <w:tcW w:w="3308" w:type="dxa"/>
+            <w:tcBorders>
+              <w:top w:val="single" w:sz="4" w:space="0" w:color="000000"/>
+              <w:left w:val="single" w:sz="4" w:space="0" w:color="000000"/>
+              <w:bottom w:val="single" w:sz="4" w:space="0" w:color="000000"/>
+              <w:right w:val="single" w:sz="4" w:space="0" w:color="000000"/>
+            </w:tcBorders>
+          </w:tcPr>
+          <w:p>
+            <w:pPr>
+              <w:pStyle w:val="TableParagraph"/>
+              <w:rPr>
+                <w:rFonts w:ascii="Times New Roman" w:hAnsi="Times New Roman"/>
+                <w:sz w:val="18"/>
+              </w:rPr>
+            </w:pPr>
+            <w:r>
+              <w:rPr>
+                <w:rFonts w:ascii="Times New Roman" w:hAnsi="Times New Roman"/>
+                <w:sz w:val="18"/>
+              </w:rPr>
+              <w:t>{{num_anexo</w:t>
+            </w:r>
+            <w:r>
+              <w:rPr>
+                <w:rFonts w:ascii="Times New Roman" w:hAnsi="Times New Roman"/>
+                <w:sz w:val="18"/>
+              </w:rPr>
+              <w:t>}}</w:t>
             </w:r>
           </w:p>
         </w:tc>
@@ -2438,21 +2447,7 @@
                 <w:rFonts w:ascii="Times New Roman" w:hAnsi="Times New Roman"/>
                 <w:sz w:val="18"/>
               </w:rPr>
-              <w:t>{{codigo_modulo_</w:t>
-            </w:r>
-            <w:r>
-              <w:rPr>
-                <w:rFonts w:ascii="Times New Roman" w:hAnsi="Times New Roman"/>
-                <w:sz w:val="18"/>
-              </w:rPr>
-              <w:t>2</w:t>
-            </w:r>
-            <w:r>
-              <w:rPr>
-                <w:rFonts w:ascii="Times New Roman" w:hAnsi="Times New Roman"/>
-                <w:sz w:val="18"/>
-              </w:rPr>
-              <w:t>}}</w:t>
+              <w:t>{{codigo_modulo_2}}</w:t>
             </w:r>
           </w:p>
         </w:tc>
@@ -2804,21 +2799,7 @@
                 <w:rFonts w:ascii="Times New Roman" w:hAnsi="Times New Roman"/>
                 <w:sz w:val="18"/>
               </w:rPr>
-              <w:t>{{codigo_modulo_</w:t>
-            </w:r>
-            <w:r>
-              <w:rPr>
-                <w:rFonts w:ascii="Times New Roman" w:hAnsi="Times New Roman"/>
-                <w:sz w:val="18"/>
-              </w:rPr>
-              <w:t>3</w:t>
-            </w:r>
-            <w:r>
-              <w:rPr>
-                <w:rFonts w:ascii="Times New Roman" w:hAnsi="Times New Roman"/>
-                <w:sz w:val="18"/>
-              </w:rPr>
-              <w:t>}}</w:t>
+              <w:t>{{codigo_modulo_3}}</w:t>
             </w:r>
           </w:p>
         </w:tc>
@@ -3170,21 +3151,7 @@
                 <w:rFonts w:ascii="Times New Roman" w:hAnsi="Times New Roman"/>
                 <w:sz w:val="18"/>
               </w:rPr>
-              <w:t>{{codigo_modulo_</w:t>
-            </w:r>
-            <w:r>
-              <w:rPr>
-                <w:rFonts w:ascii="Times New Roman" w:hAnsi="Times New Roman"/>
-                <w:sz w:val="18"/>
-              </w:rPr>
-              <w:t>4</w:t>
-            </w:r>
-            <w:r>
-              <w:rPr>
-                <w:rFonts w:ascii="Times New Roman" w:hAnsi="Times New Roman"/>
-                <w:sz w:val="18"/>
-              </w:rPr>
-              <w:t>}}</w:t>
+              <w:t>{{codigo_modulo_4}}</w:t>
             </w:r>
           </w:p>
         </w:tc>
@@ -3536,21 +3503,7 @@
                 <w:rFonts w:ascii="Times New Roman" w:hAnsi="Times New Roman"/>
                 <w:sz w:val="18"/>
               </w:rPr>
-              <w:t>{{codigo_modulo_</w:t>
-            </w:r>
-            <w:r>
-              <w:rPr>
-                <w:rFonts w:ascii="Times New Roman" w:hAnsi="Times New Roman"/>
-                <w:sz w:val="18"/>
-              </w:rPr>
-              <w:t>5</w:t>
-            </w:r>
-            <w:r>
-              <w:rPr>
-                <w:rFonts w:ascii="Times New Roman" w:hAnsi="Times New Roman"/>
-                <w:sz w:val="18"/>
-              </w:rPr>
-              <w:t>}}</w:t>
+              <w:t>{{codigo_modulo_5}}</w:t>
             </w:r>
           </w:p>
         </w:tc>
@@ -3910,15 +3863,7 @@
                 <w:sz w:val="18"/>
                 <w:u w:val="single"/>
               </w:rPr>
-              <w:t>codigo_modulo_</w:t>
-            </w:r>
-            <w:r>
-              <w:rPr>
-                <w:rFonts w:ascii="Times New Roman" w:hAnsi="Times New Roman"/>
-                <w:sz w:val="18"/>
-                <w:u w:val="single"/>
-              </w:rPr>
-              <w:t>6</w:t>
+              <w:t>codigo_modulo_6</w:t>
             </w:r>
             <w:r>
               <w:rPr>
@@ -4279,21 +4224,7 @@
                 <w:rFonts w:ascii="Times New Roman" w:hAnsi="Times New Roman"/>
                 <w:sz w:val="18"/>
               </w:rPr>
-              <w:t>{{codigo_modulo_</w:t>
-            </w:r>
-            <w:r>
-              <w:rPr>
-                <w:rFonts w:ascii="Times New Roman" w:hAnsi="Times New Roman"/>
-                <w:sz w:val="18"/>
-              </w:rPr>
-              <w:t>7</w:t>
-            </w:r>
-            <w:r>
-              <w:rPr>
-                <w:rFonts w:ascii="Times New Roman" w:hAnsi="Times New Roman"/>
-                <w:sz w:val="18"/>
-              </w:rPr>
-              <w:t>}}</w:t>
+              <w:t>{{codigo_modulo_7}}</w:t>
             </w:r>
           </w:p>
         </w:tc>
@@ -4645,21 +4576,7 @@
                 <w:rFonts w:ascii="Times New Roman" w:hAnsi="Times New Roman"/>
                 <w:sz w:val="18"/>
               </w:rPr>
-              <w:t>{{codigo_modulo_</w:t>
-            </w:r>
-            <w:r>
-              <w:rPr>
-                <w:rFonts w:ascii="Times New Roman" w:hAnsi="Times New Roman"/>
-                <w:sz w:val="18"/>
-              </w:rPr>
-              <w:t>8</w:t>
-            </w:r>
-            <w:r>
-              <w:rPr>
-                <w:rFonts w:ascii="Times New Roman" w:hAnsi="Times New Roman"/>
-                <w:sz w:val="18"/>
-              </w:rPr>
-              <w:t>}}</w:t>
+              <w:t>{{codigo_modulo_8}}</w:t>
             </w:r>
           </w:p>
         </w:tc>

</xml_diff>